<commit_message>
feat: update resume filename references and add resume generator script and documents
</commit_message>
<xml_diff>
--- a/Shubham_Kulkarni_Resume.docx
+++ b/Shubham_Kulkarni_Resume.docx
@@ -4,6 +4,8 @@
   <w:body>
     <w:p>
       <w:pPr>
+        <w:keepNext w:val="0"/>
+        <w:spacing w:before="0"/>
         <w:jc w:val="center"/>
       </w:pPr>
       <w:r>
@@ -18,7 +20,8 @@
     </w:p>
     <w:p>
       <w:pPr>
-        <w:spacing w:after="40"/>
+        <w:keepNext w:val="0"/>
+        <w:spacing w:before="0" w:after="40"/>
         <w:jc w:val="center"/>
       </w:pPr>
       <w:r>
@@ -33,6 +36,8 @@
     </w:p>
     <w:p>
       <w:pPr>
+        <w:keepNext w:val="0"/>
+        <w:spacing w:before="0"/>
         <w:jc w:val="center"/>
       </w:pPr>
       <w:r>
@@ -41,7 +46,31 @@
           <w:i w:val="0"/>
           <w:sz w:val="19"/>
         </w:rPr>
-        <w:t xml:space="preserve">Pune, Maharashtra, India  |  +91 83080 03684  |  </w:t>
+        <w:t>Pune, Maharashtra, India</w:t>
+      </w:r>
+      <w:r>
+        <w:rPr>
+          <w:b w:val="0"/>
+          <w:i w:val="0"/>
+          <w:sz w:val="19"/>
+        </w:rPr>
+        <w:t xml:space="preserve">  |  </w:t>
+      </w:r>
+      <w:r>
+        <w:rPr>
+          <w:b w:val="0"/>
+          <w:i w:val="0"/>
+          <w:sz w:val="19"/>
+        </w:rPr>
+        <w:t>+91 83080 03684</w:t>
+      </w:r>
+      <w:r>
+        <w:rPr>
+          <w:b w:val="0"/>
+          <w:i w:val="0"/>
+          <w:sz w:val="19"/>
+        </w:rPr>
+        <w:t xml:space="preserve">  |  </w:t>
       </w:r>
       <w:hyperlink r:id="rId9">
         <w:r>
@@ -55,6 +84,8 @@
     </w:p>
     <w:p>
       <w:pPr>
+        <w:keepNext w:val="0"/>
+        <w:spacing w:before="0"/>
         <w:jc w:val="center"/>
       </w:pPr>
       <w:hyperlink r:id="rId10">
@@ -104,10 +135,10 @@
     <w:p>
       <w:pPr>
         <w:keepNext/>
-        <w:spacing w:before="160" w:after="60"/>
         <w:pBdr>
           <w:bottom w:val="single" w:sz="8" w:space="1" w:color="1F3A5F"/>
         </w:pBdr>
+        <w:spacing w:before="160" w:after="60"/>
       </w:pPr>
       <w:r>
         <w:rPr>
@@ -121,6 +152,8 @@
     </w:p>
     <w:p>
       <w:pPr>
+        <w:keepNext w:val="0"/>
+        <w:spacing w:before="0"/>
         <w:jc w:val="both"/>
       </w:pPr>
       <w:r>
@@ -162,10 +195,10 @@
     <w:p>
       <w:pPr>
         <w:keepNext/>
-        <w:spacing w:before="160" w:after="60"/>
         <w:pBdr>
           <w:bottom w:val="single" w:sz="8" w:space="1" w:color="1F3A5F"/>
         </w:pBdr>
+        <w:spacing w:before="160" w:after="60"/>
       </w:pPr>
       <w:r>
         <w:rPr>
@@ -179,7 +212,8 @@
     </w:p>
     <w:p>
       <w:pPr>
-        <w:spacing w:after="30"/>
+        <w:keepNext w:val="0"/>
+        <w:spacing w:before="0" w:after="30"/>
       </w:pPr>
       <w:r>
         <w:rPr>
@@ -198,7 +232,8 @@
     </w:p>
     <w:p>
       <w:pPr>
-        <w:spacing w:after="30"/>
+        <w:keepNext w:val="0"/>
+        <w:spacing w:before="0" w:after="30"/>
       </w:pPr>
       <w:r>
         <w:rPr>
@@ -217,7 +252,8 @@
     </w:p>
     <w:p>
       <w:pPr>
-        <w:spacing w:after="30"/>
+        <w:keepNext w:val="0"/>
+        <w:spacing w:before="0" w:after="30"/>
       </w:pPr>
       <w:r>
         <w:rPr>
@@ -236,7 +272,8 @@
     </w:p>
     <w:p>
       <w:pPr>
-        <w:spacing w:after="30"/>
+        <w:keepNext w:val="0"/>
+        <w:spacing w:before="0" w:after="30"/>
       </w:pPr>
       <w:r>
         <w:rPr>
@@ -255,7 +292,8 @@
     </w:p>
     <w:p>
       <w:pPr>
-        <w:spacing w:after="30"/>
+        <w:keepNext w:val="0"/>
+        <w:spacing w:before="0" w:after="30"/>
       </w:pPr>
       <w:r>
         <w:rPr>
@@ -275,10 +313,10 @@
     <w:p>
       <w:pPr>
         <w:keepNext/>
-        <w:spacing w:before="160" w:after="60"/>
         <w:pBdr>
           <w:bottom w:val="single" w:sz="8" w:space="1" w:color="1F3A5F"/>
         </w:pBdr>
+        <w:spacing w:before="160" w:after="60"/>
       </w:pPr>
       <w:r>
         <w:rPr>
@@ -335,7 +373,6 @@
           <w:b/>
           <w:i w:val="0"/>
           <w:color w:val="1F3A5F"/>
-          <w:sz w:val="20"/>
         </w:rPr>
         <w:t>VIDES — Edge Traffic Enforcement &amp; ATCC Network</w:t>
       </w:r>
@@ -352,6 +389,7 @@
     <w:p>
       <w:pPr>
         <w:pStyle w:val="ListBullet"/>
+        <w:keepLines/>
       </w:pPr>
       <w:r>
         <w:rPr>
@@ -371,6 +409,7 @@
     <w:p>
       <w:pPr>
         <w:pStyle w:val="ListBullet"/>
+        <w:keepLines/>
       </w:pPr>
       <w:r>
         <w:rPr>
@@ -390,6 +429,7 @@
     <w:p>
       <w:pPr>
         <w:pStyle w:val="ListBullet"/>
+        <w:keepLines/>
       </w:pPr>
       <w:r>
         <w:rPr>
@@ -409,6 +449,7 @@
     <w:p>
       <w:pPr>
         <w:pStyle w:val="ListBullet"/>
+        <w:keepLines/>
       </w:pPr>
       <w:r>
         <w:rPr>
@@ -428,6 +469,7 @@
     <w:p>
       <w:pPr>
         <w:pStyle w:val="ListBullet"/>
+        <w:keepLines/>
       </w:pPr>
       <w:r>
         <w:rPr>
@@ -454,9 +496,8 @@
           <w:b/>
           <w:i w:val="0"/>
           <w:color w:val="1F3A5F"/>
-          <w:sz w:val="20"/>
         </w:rPr>
-        <w:t>TMCS — Highway Incident Detection, NHAI ATMS Standards (2023)</w:t>
+        <w:t>TMCS — Highway Incident Detection (NHAI ATMS 2023)</w:t>
       </w:r>
       <w:r>
         <w:rPr>
@@ -465,12 +506,13 @@
           <w:color w:val="444444"/>
           <w:sz w:val="19"/>
         </w:rPr>
-        <w:t xml:space="preserve">  |  YOLOv8, RT-DETR, ByteTrack, FastAPI, asyncpg, PostgreSQL, ONVIF</w:t>
+        <w:t xml:space="preserve">  |  YOLOv8, RT-DETR, ByteTrack, FastAPI, PostgreSQL, ONVIF</w:t>
       </w:r>
     </w:p>
     <w:p>
       <w:pPr>
         <w:pStyle w:val="ListBullet"/>
+        <w:keepLines/>
       </w:pPr>
       <w:r>
         <w:rPr>
@@ -490,6 +532,7 @@
     <w:p>
       <w:pPr>
         <w:pStyle w:val="ListBullet"/>
+        <w:keepLines/>
       </w:pPr>
       <w:r>
         <w:rPr>
@@ -509,6 +552,7 @@
     <w:p>
       <w:pPr>
         <w:pStyle w:val="ListBullet"/>
+        <w:keepLines/>
       </w:pPr>
       <w:r>
         <w:rPr>
@@ -528,6 +572,7 @@
     <w:p>
       <w:pPr>
         <w:pStyle w:val="ListBullet"/>
+        <w:keepLines/>
       </w:pPr>
       <w:r>
         <w:rPr>
@@ -554,7 +599,6 @@
           <w:b/>
           <w:i w:val="0"/>
           <w:color w:val="1F3A5F"/>
-          <w:sz w:val="20"/>
         </w:rPr>
         <w:t>Vehicle Re-Identification &amp; Forensic Matching</w:t>
       </w:r>
@@ -571,6 +615,7 @@
     <w:p>
       <w:pPr>
         <w:pStyle w:val="ListBullet"/>
+        <w:keepLines/>
       </w:pPr>
       <w:r>
         <w:rPr>
@@ -590,6 +635,7 @@
     <w:p>
       <w:pPr>
         <w:pStyle w:val="ListBullet"/>
+        <w:keepLines/>
       </w:pPr>
       <w:r>
         <w:rPr>
@@ -616,7 +662,6 @@
           <w:b/>
           <w:i w:val="0"/>
           <w:color w:val="1F3A5F"/>
-          <w:sz w:val="20"/>
         </w:rPr>
         <w:t>Earlier Experience</w:t>
       </w:r>
@@ -624,6 +669,7 @@
     <w:p>
       <w:pPr>
         <w:pStyle w:val="ListBullet"/>
+        <w:keepLines/>
       </w:pPr>
       <w:r>
         <w:rPr>
@@ -643,6 +689,7 @@
     <w:p>
       <w:pPr>
         <w:pStyle w:val="ListBullet"/>
+        <w:keepLines/>
       </w:pPr>
       <w:r>
         <w:rPr>
@@ -662,6 +709,7 @@
     <w:p>
       <w:pPr>
         <w:pStyle w:val="ListBullet"/>
+        <w:keepLines/>
       </w:pPr>
       <w:r>
         <w:rPr>
@@ -681,10 +729,10 @@
     <w:p>
       <w:pPr>
         <w:keepNext/>
-        <w:spacing w:before="160" w:after="60"/>
         <w:pBdr>
           <w:bottom w:val="single" w:sz="8" w:space="1" w:color="1F3A5F"/>
         </w:pBdr>
+        <w:spacing w:before="160" w:after="60"/>
       </w:pPr>
       <w:r>
         <w:rPr>
@@ -735,6 +783,7 @@
     <w:p>
       <w:pPr>
         <w:keepNext/>
+        <w:spacing w:before="0"/>
       </w:pPr>
       <w:hyperlink r:id="rId13">
         <w:r>
@@ -749,6 +798,7 @@
     <w:p>
       <w:pPr>
         <w:pStyle w:val="ListBullet"/>
+        <w:keepLines/>
       </w:pPr>
       <w:r>
         <w:rPr>
@@ -797,6 +847,7 @@
     <w:p>
       <w:pPr>
         <w:keepNext/>
+        <w:spacing w:before="0"/>
       </w:pPr>
       <w:hyperlink r:id="rId14">
         <w:r>
@@ -811,6 +862,7 @@
     <w:p>
       <w:pPr>
         <w:pStyle w:val="ListBullet"/>
+        <w:keepLines/>
       </w:pPr>
       <w:r>
         <w:rPr>
@@ -843,7 +895,7 @@
           <w:color w:val="444444"/>
           <w:sz w:val="19"/>
         </w:rPr>
-        <w:t xml:space="preserve">  |  Python, FastAPI, LangChain, FAISS, Mistral, Ollama</w:t>
+        <w:t xml:space="preserve">  |  FastAPI, LangChain, FAISS, Mistral, Ollama</w:t>
       </w:r>
       <w:r>
         <w:rPr>
@@ -859,6 +911,7 @@
     <w:p>
       <w:pPr>
         <w:keepNext/>
+        <w:spacing w:before="0"/>
       </w:pPr>
       <w:hyperlink r:id="rId15">
         <w:r>
@@ -873,6 +926,7 @@
     <w:p>
       <w:pPr>
         <w:pStyle w:val="ListBullet"/>
+        <w:keepLines/>
       </w:pPr>
       <w:r>
         <w:rPr>
@@ -885,6 +939,7 @@
     <w:p>
       <w:pPr>
         <w:pStyle w:val="ListBullet"/>
+        <w:keepLines/>
       </w:pPr>
       <w:r>
         <w:rPr>
@@ -933,6 +988,7 @@
     <w:p>
       <w:pPr>
         <w:keepNext/>
+        <w:spacing w:before="0"/>
       </w:pPr>
       <w:hyperlink r:id="rId16">
         <w:r>
@@ -947,6 +1003,7 @@
     <w:p>
       <w:pPr>
         <w:pStyle w:val="ListBullet"/>
+        <w:keepLines/>
       </w:pPr>
       <w:r>
         <w:rPr>
@@ -979,7 +1036,7 @@
           <w:color w:val="444444"/>
           <w:sz w:val="19"/>
         </w:rPr>
-        <w:t xml:space="preserve">  |  Django DRF, PostgreSQL, WebSockets, JWT, ES6</w:t>
+        <w:t xml:space="preserve">  |  Django DRF, PostgreSQL, WebSockets</w:t>
       </w:r>
       <w:r>
         <w:rPr>
@@ -995,6 +1052,7 @@
     <w:p>
       <w:pPr>
         <w:keepNext/>
+        <w:spacing w:before="0"/>
       </w:pPr>
       <w:hyperlink r:id="rId17">
         <w:r>
@@ -1009,6 +1067,7 @@
     <w:p>
       <w:pPr>
         <w:pStyle w:val="ListBullet"/>
+        <w:keepLines/>
       </w:pPr>
       <w:r>
         <w:rPr>
@@ -1021,10 +1080,10 @@
     <w:p>
       <w:pPr>
         <w:keepNext/>
-        <w:spacing w:before="160" w:after="60"/>
         <w:pBdr>
           <w:bottom w:val="single" w:sz="8" w:space="1" w:color="1F3A5F"/>
         </w:pBdr>
+        <w:spacing w:before="160" w:after="60"/>
       </w:pPr>
       <w:r>
         <w:rPr>
@@ -1073,7 +1132,8 @@
     </w:p>
     <w:p>
       <w:pPr>
-        <w:keepNext/>
+        <w:keepNext w:val="0"/>
+        <w:spacing w:before="0"/>
       </w:pPr>
       <w:r>
         <w:rPr>
@@ -1088,10 +1148,10 @@
     <w:p>
       <w:pPr>
         <w:keepNext/>
-        <w:spacing w:before="160" w:after="60"/>
         <w:pBdr>
           <w:bottom w:val="single" w:sz="8" w:space="1" w:color="1F3A5F"/>
         </w:pBdr>
+        <w:spacing w:before="160" w:after="60"/>
       </w:pPr>
       <w:r>
         <w:rPr>
@@ -1106,6 +1166,7 @@
     <w:p>
       <w:pPr>
         <w:pStyle w:val="ListBullet"/>
+        <w:keepLines/>
       </w:pPr>
       <w:r>
         <w:rPr>
@@ -1125,6 +1186,7 @@
     <w:p>
       <w:pPr>
         <w:pStyle w:val="ListBullet"/>
+        <w:keepLines/>
       </w:pPr>
       <w:r>
         <w:rPr>
@@ -1144,6 +1206,7 @@
     <w:p>
       <w:pPr>
         <w:pStyle w:val="ListBullet"/>
+        <w:keepLines/>
       </w:pPr>
       <w:r>
         <w:rPr>
@@ -1163,6 +1226,7 @@
     <w:p>
       <w:pPr>
         <w:pStyle w:val="ListBullet"/>
+        <w:keepLines/>
       </w:pPr>
       <w:r>
         <w:rPr>
@@ -1553,7 +1617,7 @@
     <w:qFormat/>
     <w:rsid w:val="00FC693F"/>
     <w:pPr>
-      <w:spacing w:after="0" w:before="0" w:line="252" w:lineRule="auto"/>
+      <w:spacing w:before="0" w:line="252" w:lineRule="auto" w:after="0"/>
     </w:pPr>
     <w:rPr>
       <w:rFonts w:ascii="Calibri" w:hAnsi="Calibri" w:eastAsia="Calibri"/>
@@ -2086,11 +2150,11 @@
       <w:numPr>
         <w:numId w:val="1"/>
       </w:numPr>
-      <w:spacing w:after="30" w:line="252" w:lineRule="auto"/>
+      <w:spacing w:before="0" w:line="252" w:lineRule="auto" w:after="30"/>
       <w:contextualSpacing/>
     </w:pPr>
     <w:rPr>
-      <w:rFonts w:ascii="Calibri" w:hAnsi="Calibri"/>
+      <w:rFonts w:ascii="Calibri" w:hAnsi="Calibri" w:eastAsia="Calibri"/>
       <w:sz w:val="20"/>
     </w:rPr>
   </w:style>

</xml_diff>